<commit_message>
Mapeo de Arancel y Promociones (AS-IS/TO-BE) - Mejoras visuales y corrección de etiquetas
</commit_message>
<xml_diff>
--- a/1.AS-IS (INCRIPCION) TO-BE.docx
+++ b/1.AS-IS (INCRIPCION) TO-BE.docx
@@ -490,7 +490,6 @@
               </w:rPr>
               <w:t xml:space="preserve">Identificación de un registro "No Procesado" en el módulo </w:t>
             </w:r>
-            <w:proofErr w:type="spellStart"/>
             <w:r>
               <w:rPr>
                 <w:rFonts w:ascii="Times New Roman" w:eastAsia="Times New Roman" w:hAnsi="Times New Roman" w:cs="Times New Roman"/>
@@ -500,33 +499,8 @@
                 <w:szCs w:val="24"/>
                 <w:lang w:eastAsia="es-VE"/>
               </w:rPr>
-              <w:t>Payment</w:t>
-            </w:r>
-            <w:proofErr w:type="spellEnd"/>
-            <w:r>
-              <w:rPr>
-                <w:rFonts w:ascii="Times New Roman" w:eastAsia="Times New Roman" w:hAnsi="Times New Roman" w:cs="Times New Roman"/>
-                <w:i/>
-                <w:iCs/>
-                <w:sz w:val="24"/>
-                <w:szCs w:val="24"/>
-                <w:lang w:eastAsia="es-VE"/>
-              </w:rPr>
-              <w:t xml:space="preserve"> </w:t>
-            </w:r>
-            <w:proofErr w:type="spellStart"/>
-            <w:r>
-              <w:rPr>
-                <w:rFonts w:ascii="Times New Roman" w:eastAsia="Times New Roman" w:hAnsi="Times New Roman" w:cs="Times New Roman"/>
-                <w:i/>
-                <w:iCs/>
-                <w:sz w:val="24"/>
-                <w:szCs w:val="24"/>
-                <w:lang w:eastAsia="es-VE"/>
-              </w:rPr>
-              <w:t>Record</w:t>
-            </w:r>
-            <w:proofErr w:type="spellEnd"/>
+              <w:t>Payment Record</w:t>
+            </w:r>
             <w:r>
               <w:rPr>
                 <w:rFonts w:ascii="Times New Roman" w:eastAsia="Times New Roman" w:hAnsi="Times New Roman" w:cs="Times New Roman"/>
@@ -774,31 +748,7 @@
           <w:szCs w:val="36"/>
           <w:lang w:eastAsia="es-VE"/>
         </w:rPr>
-        <w:t xml:space="preserve">2. Actores Involucrados (Pools y Carriles / </w:t>
-      </w:r>
-      <w:proofErr w:type="spellStart"/>
-      <w:r>
-        <w:rPr>
-          <w:rFonts w:ascii="Times New Roman" w:eastAsia="Times New Roman" w:hAnsi="Times New Roman" w:cs="Times New Roman"/>
-          <w:b/>
-          <w:bCs/>
-          <w:sz w:val="36"/>
-          <w:szCs w:val="36"/>
-          <w:lang w:eastAsia="es-VE"/>
-        </w:rPr>
-        <w:t>Lanes</w:t>
-      </w:r>
-      <w:proofErr w:type="spellEnd"/>
-      <w:r>
-        <w:rPr>
-          <w:rFonts w:ascii="Times New Roman" w:eastAsia="Times New Roman" w:hAnsi="Times New Roman" w:cs="Times New Roman"/>
-          <w:b/>
-          <w:bCs/>
-          <w:sz w:val="36"/>
-          <w:szCs w:val="36"/>
-          <w:lang w:eastAsia="es-VE"/>
-        </w:rPr>
-        <w:t>)</w:t>
+        <w:t>2. Actores Involucrados (Pools y Carriles / Lanes)</w:t>
       </w:r>
     </w:p>
     <w:tbl>
@@ -1061,7 +1011,6 @@
                 <w:lang w:eastAsia="es-VE"/>
               </w:rPr>
             </w:pPr>
-            <w:proofErr w:type="spellStart"/>
             <w:r>
               <w:rPr>
                 <w:rFonts w:ascii="Times New Roman" w:eastAsia="Times New Roman" w:hAnsi="Times New Roman" w:cs="Times New Roman"/>
@@ -1071,19 +1020,7 @@
                 <w:szCs w:val="24"/>
                 <w:lang w:eastAsia="es-VE"/>
               </w:rPr>
-              <w:t>vTiger</w:t>
-            </w:r>
-            <w:proofErr w:type="spellEnd"/>
-            <w:r>
-              <w:rPr>
-                <w:rFonts w:ascii="Times New Roman" w:eastAsia="Times New Roman" w:hAnsi="Times New Roman" w:cs="Times New Roman"/>
-                <w:b/>
-                <w:bCs/>
-                <w:sz w:val="24"/>
-                <w:szCs w:val="24"/>
-                <w:lang w:eastAsia="es-VE"/>
-              </w:rPr>
-              <w:t xml:space="preserve"> CRM</w:t>
+              <w:t>vTiger CRM</w:t>
             </w:r>
           </w:p>
         </w:tc>
@@ -1304,31 +1241,7 @@
                 <w:szCs w:val="24"/>
                 <w:lang w:eastAsia="es-VE"/>
               </w:rPr>
-              <w:t>Tarea / Actividad (</w:t>
-            </w:r>
-            <w:proofErr w:type="spellStart"/>
-            <w:r>
-              <w:rPr>
-                <w:rFonts w:ascii="Times New Roman" w:eastAsia="Times New Roman" w:hAnsi="Times New Roman" w:cs="Times New Roman"/>
-                <w:b/>
-                <w:bCs/>
-                <w:sz w:val="24"/>
-                <w:szCs w:val="24"/>
-                <w:lang w:eastAsia="es-VE"/>
-              </w:rPr>
-              <w:t>Task</w:t>
-            </w:r>
-            <w:proofErr w:type="spellEnd"/>
-            <w:r>
-              <w:rPr>
-                <w:rFonts w:ascii="Times New Roman" w:eastAsia="Times New Roman" w:hAnsi="Times New Roman" w:cs="Times New Roman"/>
-                <w:b/>
-                <w:bCs/>
-                <w:sz w:val="24"/>
-                <w:szCs w:val="24"/>
-                <w:lang w:eastAsia="es-VE"/>
-              </w:rPr>
-              <w:t>)</w:t>
+              <w:t>Tarea / Actividad (Task)</w:t>
             </w:r>
           </w:p>
         </w:tc>
@@ -1493,65 +1406,14 @@
                 <w:lang w:eastAsia="es-VE"/>
               </w:rPr>
             </w:pPr>
-            <w:proofErr w:type="spellStart"/>
-            <w:r>
-              <w:rPr>
-                <w:rFonts w:ascii="Times New Roman" w:eastAsia="Times New Roman" w:hAnsi="Times New Roman" w:cs="Times New Roman"/>
-                <w:sz w:val="24"/>
-                <w:szCs w:val="24"/>
-                <w:lang w:eastAsia="es-VE"/>
-              </w:rPr>
-              <w:t>vTiger</w:t>
-            </w:r>
-            <w:proofErr w:type="spellEnd"/>
-            <w:r>
-              <w:rPr>
-                <w:rFonts w:ascii="Times New Roman" w:eastAsia="Times New Roman" w:hAnsi="Times New Roman" w:cs="Times New Roman"/>
-                <w:sz w:val="24"/>
-                <w:szCs w:val="24"/>
-                <w:lang w:eastAsia="es-VE"/>
-              </w:rPr>
-              <w:t xml:space="preserve"> (</w:t>
-            </w:r>
-            <w:proofErr w:type="spellStart"/>
-            <w:r>
-              <w:rPr>
-                <w:rFonts w:ascii="Times New Roman" w:eastAsia="Times New Roman" w:hAnsi="Times New Roman" w:cs="Times New Roman"/>
-                <w:sz w:val="24"/>
-                <w:szCs w:val="24"/>
-                <w:lang w:eastAsia="es-VE"/>
-              </w:rPr>
-              <w:t>Payment</w:t>
-            </w:r>
-            <w:proofErr w:type="spellEnd"/>
-            <w:r>
-              <w:rPr>
-                <w:rFonts w:ascii="Times New Roman" w:eastAsia="Times New Roman" w:hAnsi="Times New Roman" w:cs="Times New Roman"/>
-                <w:sz w:val="24"/>
-                <w:szCs w:val="24"/>
-                <w:lang w:eastAsia="es-VE"/>
-              </w:rPr>
-              <w:t xml:space="preserve"> </w:t>
-            </w:r>
-            <w:proofErr w:type="spellStart"/>
-            <w:r>
-              <w:rPr>
-                <w:rFonts w:ascii="Times New Roman" w:eastAsia="Times New Roman" w:hAnsi="Times New Roman" w:cs="Times New Roman"/>
-                <w:sz w:val="24"/>
-                <w:szCs w:val="24"/>
-                <w:lang w:eastAsia="es-VE"/>
-              </w:rPr>
-              <w:t>Record</w:t>
-            </w:r>
-            <w:proofErr w:type="spellEnd"/>
-            <w:r>
-              <w:rPr>
-                <w:rFonts w:ascii="Times New Roman" w:eastAsia="Times New Roman" w:hAnsi="Times New Roman" w:cs="Times New Roman"/>
-                <w:sz w:val="24"/>
-                <w:szCs w:val="24"/>
-                <w:lang w:eastAsia="es-VE"/>
-              </w:rPr>
-              <w:t xml:space="preserve">) </w:t>
+            <w:r>
+              <w:rPr>
+                <w:rFonts w:ascii="Times New Roman" w:eastAsia="Times New Roman" w:hAnsi="Times New Roman" w:cs="Times New Roman"/>
+                <w:sz w:val="24"/>
+                <w:szCs w:val="24"/>
+                <w:lang w:eastAsia="es-VE"/>
+              </w:rPr>
+              <w:t xml:space="preserve">vTiger (Payment Record) </w:t>
             </w:r>
           </w:p>
         </w:tc>
@@ -1818,25 +1680,14 @@
                 <w:lang w:eastAsia="es-VE"/>
               </w:rPr>
             </w:pPr>
-            <w:proofErr w:type="spellStart"/>
-            <w:r>
-              <w:rPr>
-                <w:rFonts w:ascii="Times New Roman" w:eastAsia="Times New Roman" w:hAnsi="Times New Roman" w:cs="Times New Roman"/>
-                <w:sz w:val="24"/>
-                <w:szCs w:val="24"/>
-                <w:lang w:eastAsia="es-VE"/>
-              </w:rPr>
-              <w:t>vTiger</w:t>
-            </w:r>
-            <w:proofErr w:type="spellEnd"/>
-            <w:r>
-              <w:rPr>
-                <w:rFonts w:ascii="Times New Roman" w:eastAsia="Times New Roman" w:hAnsi="Times New Roman" w:cs="Times New Roman"/>
-                <w:sz w:val="24"/>
-                <w:szCs w:val="24"/>
-                <w:lang w:eastAsia="es-VE"/>
-              </w:rPr>
-              <w:t xml:space="preserve"> (Contactos) </w:t>
+            <w:r>
+              <w:rPr>
+                <w:rFonts w:ascii="Times New Roman" w:eastAsia="Times New Roman" w:hAnsi="Times New Roman" w:cs="Times New Roman"/>
+                <w:sz w:val="24"/>
+                <w:szCs w:val="24"/>
+                <w:lang w:eastAsia="es-VE"/>
+              </w:rPr>
+              <w:t xml:space="preserve">vTiger (Contactos) </w:t>
             </w:r>
           </w:p>
         </w:tc>
@@ -1966,25 +1817,14 @@
                 <w:lang w:eastAsia="es-VE"/>
               </w:rPr>
             </w:pPr>
-            <w:proofErr w:type="spellStart"/>
-            <w:r>
-              <w:rPr>
-                <w:rFonts w:ascii="Times New Roman" w:eastAsia="Times New Roman" w:hAnsi="Times New Roman" w:cs="Times New Roman"/>
-                <w:sz w:val="24"/>
-                <w:szCs w:val="24"/>
-                <w:lang w:eastAsia="es-VE"/>
-              </w:rPr>
-              <w:t>vTiger</w:t>
-            </w:r>
-            <w:proofErr w:type="spellEnd"/>
-            <w:r>
-              <w:rPr>
-                <w:rFonts w:ascii="Times New Roman" w:eastAsia="Times New Roman" w:hAnsi="Times New Roman" w:cs="Times New Roman"/>
-                <w:sz w:val="24"/>
-                <w:szCs w:val="24"/>
-                <w:lang w:eastAsia="es-VE"/>
-              </w:rPr>
-              <w:t xml:space="preserve"> (Lista relacionada) </w:t>
+            <w:r>
+              <w:rPr>
+                <w:rFonts w:ascii="Times New Roman" w:eastAsia="Times New Roman" w:hAnsi="Times New Roman" w:cs="Times New Roman"/>
+                <w:sz w:val="24"/>
+                <w:szCs w:val="24"/>
+                <w:lang w:eastAsia="es-VE"/>
+              </w:rPr>
+              <w:t xml:space="preserve">vTiger (Lista relacionada) </w:t>
             </w:r>
           </w:p>
         </w:tc>
@@ -2251,25 +2091,14 @@
                 <w:lang w:eastAsia="es-VE"/>
               </w:rPr>
             </w:pPr>
-            <w:proofErr w:type="spellStart"/>
-            <w:r>
-              <w:rPr>
-                <w:rFonts w:ascii="Times New Roman" w:eastAsia="Times New Roman" w:hAnsi="Times New Roman" w:cs="Times New Roman"/>
-                <w:sz w:val="24"/>
-                <w:szCs w:val="24"/>
-                <w:lang w:eastAsia="es-VE"/>
-              </w:rPr>
-              <w:t>vTiger</w:t>
-            </w:r>
-            <w:proofErr w:type="spellEnd"/>
-            <w:r>
-              <w:rPr>
-                <w:rFonts w:ascii="Times New Roman" w:eastAsia="Times New Roman" w:hAnsi="Times New Roman" w:cs="Times New Roman"/>
-                <w:sz w:val="24"/>
-                <w:szCs w:val="24"/>
-                <w:lang w:eastAsia="es-VE"/>
-              </w:rPr>
-              <w:t xml:space="preserve"> (Módulo Oportunidades) </w:t>
+            <w:r>
+              <w:rPr>
+                <w:rFonts w:ascii="Times New Roman" w:eastAsia="Times New Roman" w:hAnsi="Times New Roman" w:cs="Times New Roman"/>
+                <w:sz w:val="24"/>
+                <w:szCs w:val="24"/>
+                <w:lang w:eastAsia="es-VE"/>
+              </w:rPr>
+              <w:t xml:space="preserve">vTiger (Módulo Oportunidades) </w:t>
             </w:r>
           </w:p>
         </w:tc>
@@ -2399,25 +2228,14 @@
                 <w:lang w:eastAsia="es-VE"/>
               </w:rPr>
             </w:pPr>
-            <w:proofErr w:type="spellStart"/>
-            <w:r>
-              <w:rPr>
-                <w:rFonts w:ascii="Times New Roman" w:eastAsia="Times New Roman" w:hAnsi="Times New Roman" w:cs="Times New Roman"/>
-                <w:sz w:val="24"/>
-                <w:szCs w:val="24"/>
-                <w:lang w:eastAsia="es-VE"/>
-              </w:rPr>
-              <w:t>Voucher</w:t>
-            </w:r>
-            <w:proofErr w:type="spellEnd"/>
-            <w:r>
-              <w:rPr>
-                <w:rFonts w:ascii="Times New Roman" w:eastAsia="Times New Roman" w:hAnsi="Times New Roman" w:cs="Times New Roman"/>
-                <w:sz w:val="24"/>
-                <w:szCs w:val="24"/>
-                <w:lang w:eastAsia="es-VE"/>
-              </w:rPr>
-              <w:t xml:space="preserve"> de pago </w:t>
+            <w:r>
+              <w:rPr>
+                <w:rFonts w:ascii="Times New Roman" w:eastAsia="Times New Roman" w:hAnsi="Times New Roman" w:cs="Times New Roman"/>
+                <w:sz w:val="24"/>
+                <w:szCs w:val="24"/>
+                <w:lang w:eastAsia="es-VE"/>
+              </w:rPr>
+              <w:t xml:space="preserve">Voucher de pago </w:t>
             </w:r>
           </w:p>
         </w:tc>
@@ -2547,25 +2365,14 @@
                 <w:lang w:eastAsia="es-VE"/>
               </w:rPr>
             </w:pPr>
-            <w:proofErr w:type="spellStart"/>
-            <w:r>
-              <w:rPr>
-                <w:rFonts w:ascii="Times New Roman" w:eastAsia="Times New Roman" w:hAnsi="Times New Roman" w:cs="Times New Roman"/>
-                <w:sz w:val="24"/>
-                <w:szCs w:val="24"/>
-                <w:lang w:eastAsia="es-VE"/>
-              </w:rPr>
-              <w:t>vTiger</w:t>
-            </w:r>
-            <w:proofErr w:type="spellEnd"/>
-            <w:r>
-              <w:rPr>
-                <w:rFonts w:ascii="Times New Roman" w:eastAsia="Times New Roman" w:hAnsi="Times New Roman" w:cs="Times New Roman"/>
-                <w:sz w:val="24"/>
-                <w:szCs w:val="24"/>
-                <w:lang w:eastAsia="es-VE"/>
-              </w:rPr>
-              <w:t xml:space="preserve"> (Detalles Elemento) </w:t>
+            <w:r>
+              <w:rPr>
+                <w:rFonts w:ascii="Times New Roman" w:eastAsia="Times New Roman" w:hAnsi="Times New Roman" w:cs="Times New Roman"/>
+                <w:sz w:val="24"/>
+                <w:szCs w:val="24"/>
+                <w:lang w:eastAsia="es-VE"/>
+              </w:rPr>
+              <w:t xml:space="preserve">vTiger (Detalles Elemento) </w:t>
             </w:r>
           </w:p>
         </w:tc>
@@ -2695,25 +2502,14 @@
                 <w:lang w:eastAsia="es-VE"/>
               </w:rPr>
             </w:pPr>
-            <w:proofErr w:type="spellStart"/>
-            <w:r>
-              <w:rPr>
-                <w:rFonts w:ascii="Times New Roman" w:eastAsia="Times New Roman" w:hAnsi="Times New Roman" w:cs="Times New Roman"/>
-                <w:sz w:val="24"/>
-                <w:szCs w:val="24"/>
-                <w:lang w:eastAsia="es-VE"/>
-              </w:rPr>
-              <w:t>vTiger</w:t>
-            </w:r>
-            <w:proofErr w:type="spellEnd"/>
-            <w:r>
-              <w:rPr>
-                <w:rFonts w:ascii="Times New Roman" w:eastAsia="Times New Roman" w:hAnsi="Times New Roman" w:cs="Times New Roman"/>
-                <w:sz w:val="24"/>
-                <w:szCs w:val="24"/>
-                <w:lang w:eastAsia="es-VE"/>
-              </w:rPr>
-              <w:t xml:space="preserve"> CRM </w:t>
+            <w:r>
+              <w:rPr>
+                <w:rFonts w:ascii="Times New Roman" w:eastAsia="Times New Roman" w:hAnsi="Times New Roman" w:cs="Times New Roman"/>
+                <w:sz w:val="24"/>
+                <w:szCs w:val="24"/>
+                <w:lang w:eastAsia="es-VE"/>
+              </w:rPr>
+              <w:t xml:space="preserve">vTiger CRM </w:t>
             </w:r>
           </w:p>
         </w:tc>
@@ -2741,31 +2537,7 @@
           <w:szCs w:val="36"/>
           <w:lang w:eastAsia="es-VE"/>
         </w:rPr>
-        <w:t>4. Reglas de Negocio y Puertas de Enlace (</w:t>
-      </w:r>
-      <w:proofErr w:type="spellStart"/>
-      <w:r>
-        <w:rPr>
-          <w:rFonts w:ascii="Times New Roman" w:eastAsia="Times New Roman" w:hAnsi="Times New Roman" w:cs="Times New Roman"/>
-          <w:b/>
-          <w:bCs/>
-          <w:sz w:val="36"/>
-          <w:szCs w:val="36"/>
-          <w:lang w:eastAsia="es-VE"/>
-        </w:rPr>
-        <w:t>Gateways</w:t>
-      </w:r>
-      <w:proofErr w:type="spellEnd"/>
-      <w:r>
-        <w:rPr>
-          <w:rFonts w:ascii="Times New Roman" w:eastAsia="Times New Roman" w:hAnsi="Times New Roman" w:cs="Times New Roman"/>
-          <w:b/>
-          <w:bCs/>
-          <w:sz w:val="36"/>
-          <w:szCs w:val="36"/>
-          <w:lang w:eastAsia="es-VE"/>
-        </w:rPr>
-        <w:t>)</w:t>
+        <w:t>4. Reglas de Negocio y Puertas de Enlace (Gateways)</w:t>
       </w:r>
     </w:p>
     <w:p>
@@ -2840,27 +2612,7 @@
           <w:szCs w:val="24"/>
           <w:lang w:eastAsia="es-VE"/>
         </w:rPr>
-        <w:t xml:space="preserve"> Los datos del </w:t>
-      </w:r>
-      <w:proofErr w:type="spellStart"/>
-      <w:r>
-        <w:rPr>
-          <w:rFonts w:ascii="Times New Roman" w:eastAsia="Times New Roman" w:hAnsi="Times New Roman" w:cs="Times New Roman"/>
-          <w:sz w:val="24"/>
-          <w:szCs w:val="24"/>
-          <w:lang w:eastAsia="es-VE"/>
-        </w:rPr>
-        <w:t>voucher</w:t>
-      </w:r>
-      <w:proofErr w:type="spellEnd"/>
-      <w:r>
-        <w:rPr>
-          <w:rFonts w:ascii="Times New Roman" w:eastAsia="Times New Roman" w:hAnsi="Times New Roman" w:cs="Times New Roman"/>
-          <w:sz w:val="24"/>
-          <w:szCs w:val="24"/>
-          <w:lang w:eastAsia="es-VE"/>
-        </w:rPr>
-        <w:t xml:space="preserve"> coinciden con el registro. Se procede a crear la factura. </w:t>
+        <w:t xml:space="preserve"> Los datos del voucher coinciden con el registro. Se procede a crear la factura. </w:t>
       </w:r>
     </w:p>
     <w:p>
@@ -3138,27 +2890,7 @@
           <w:szCs w:val="24"/>
           <w:lang w:eastAsia="es-VE"/>
         </w:rPr>
-        <w:t xml:space="preserve"> El cotejo entre el "Precio de Venta" y el </w:t>
-      </w:r>
-      <w:proofErr w:type="spellStart"/>
-      <w:r>
-        <w:rPr>
-          <w:rFonts w:ascii="Times New Roman" w:eastAsia="Times New Roman" w:hAnsi="Times New Roman" w:cs="Times New Roman"/>
-          <w:sz w:val="24"/>
-          <w:szCs w:val="24"/>
-          <w:lang w:eastAsia="es-VE"/>
-        </w:rPr>
-        <w:t>voucher</w:t>
-      </w:r>
-      <w:proofErr w:type="spellEnd"/>
-      <w:r>
-        <w:rPr>
-          <w:rFonts w:ascii="Times New Roman" w:eastAsia="Times New Roman" w:hAnsi="Times New Roman" w:cs="Times New Roman"/>
-          <w:sz w:val="24"/>
-          <w:szCs w:val="24"/>
-          <w:lang w:eastAsia="es-VE"/>
-        </w:rPr>
-        <w:t xml:space="preserve"> es puramente visual, sin una regla de validación automática en el sistema.</w:t>
+        <w:t xml:space="preserve"> El cotejo entre el "Precio de Venta" y el voucher es puramente visual, sin una regla de validación automática en el sistema.</w:t>
       </w:r>
     </w:p>
     <w:p>
@@ -3167,7 +2899,61 @@
       </w:r>
     </w:p>
     <w:p/>
-    <w:p/>
+    <w:p>
+      <w:r>
+        <w:rPr>
+          <w:noProof/>
+        </w:rPr>
+        <w:drawing>
+          <wp:inline distT="0" distB="0" distL="0" distR="0" wp14:anchorId="17F6E104" wp14:editId="2C888286">
+            <wp:extent cx="19166840" cy="2612390"/>
+            <wp:effectExtent l="0" t="0" r="0" b="0"/>
+            <wp:docPr id="2" name="Imagen 2"/>
+            <wp:cNvGraphicFramePr>
+              <a:graphicFrameLocks xmlns:a="http://schemas.openxmlformats.org/drawingml/2006/main" noChangeAspect="1"/>
+            </wp:cNvGraphicFramePr>
+            <a:graphic xmlns:a="http://schemas.openxmlformats.org/drawingml/2006/main">
+              <a:graphicData uri="http://schemas.openxmlformats.org/drawingml/2006/picture">
+                <pic:pic xmlns:pic="http://schemas.openxmlformats.org/drawingml/2006/picture">
+                  <pic:nvPicPr>
+                    <pic:cNvPr id="0" name="Picture 6"/>
+                    <pic:cNvPicPr>
+                      <a:picLocks noChangeAspect="1" noChangeArrowheads="1"/>
+                    </pic:cNvPicPr>
+                  </pic:nvPicPr>
+                  <pic:blipFill>
+                    <a:blip r:embed="rId5" cstate="print">
+                      <a:extLst>
+                        <a:ext uri="{28A0092B-C50C-407E-A947-70E740481C1C}">
+                          <a14:useLocalDpi xmlns:a14="http://schemas.microsoft.com/office/drawing/2010/main" val="0"/>
+                        </a:ext>
+                      </a:extLst>
+                    </a:blip>
+                    <a:srcRect/>
+                    <a:stretch>
+                      <a:fillRect/>
+                    </a:stretch>
+                  </pic:blipFill>
+                  <pic:spPr bwMode="auto">
+                    <a:xfrm>
+                      <a:off x="0" y="0"/>
+                      <a:ext cx="19166840" cy="2612390"/>
+                    </a:xfrm>
+                    <a:prstGeom prst="rect">
+                      <a:avLst/>
+                    </a:prstGeom>
+                    <a:noFill/>
+                    <a:ln>
+                      <a:noFill/>
+                    </a:ln>
+                  </pic:spPr>
+                </pic:pic>
+              </a:graphicData>
+            </a:graphic>
+          </wp:inline>
+        </w:drawing>
+      </w:r>
+    </w:p>
     <w:p/>
     <w:p/>
     <w:p>
@@ -3658,7 +3444,6 @@
               </w:rPr>
               <w:t xml:space="preserve">Registro de un nuevo pago en el módulo </w:t>
             </w:r>
-            <w:proofErr w:type="spellStart"/>
             <w:r>
               <w:rPr>
                 <w:rFonts w:ascii="Times New Roman" w:eastAsia="Times New Roman" w:hAnsi="Times New Roman" w:cs="Times New Roman"/>
@@ -3668,33 +3453,8 @@
                 <w:szCs w:val="24"/>
                 <w:lang w:eastAsia="es-VE"/>
               </w:rPr>
-              <w:t>Payment</w:t>
-            </w:r>
-            <w:proofErr w:type="spellEnd"/>
-            <w:r>
-              <w:rPr>
-                <w:rFonts w:ascii="Times New Roman" w:eastAsia="Times New Roman" w:hAnsi="Times New Roman" w:cs="Times New Roman"/>
-                <w:i/>
-                <w:iCs/>
-                <w:sz w:val="24"/>
-                <w:szCs w:val="24"/>
-                <w:lang w:eastAsia="es-VE"/>
-              </w:rPr>
-              <w:t xml:space="preserve"> </w:t>
-            </w:r>
-            <w:proofErr w:type="spellStart"/>
-            <w:r>
-              <w:rPr>
-                <w:rFonts w:ascii="Times New Roman" w:eastAsia="Times New Roman" w:hAnsi="Times New Roman" w:cs="Times New Roman"/>
-                <w:i/>
-                <w:iCs/>
-                <w:sz w:val="24"/>
-                <w:szCs w:val="24"/>
-                <w:lang w:eastAsia="es-VE"/>
-              </w:rPr>
-              <w:t>Record</w:t>
-            </w:r>
-            <w:proofErr w:type="spellEnd"/>
+              <w:t>Payment Record</w:t>
+            </w:r>
             <w:r>
               <w:rPr>
                 <w:rFonts w:ascii="Times New Roman" w:eastAsia="Times New Roman" w:hAnsi="Times New Roman" w:cs="Times New Roman"/>
@@ -3964,31 +3724,7 @@
           <w:szCs w:val="36"/>
           <w:lang w:eastAsia="es-VE"/>
         </w:rPr>
-        <w:t>2. Actores Involucrados (</w:t>
-      </w:r>
-      <w:proofErr w:type="spellStart"/>
-      <w:r>
-        <w:rPr>
-          <w:rFonts w:ascii="Times New Roman" w:eastAsia="Times New Roman" w:hAnsi="Times New Roman" w:cs="Times New Roman"/>
-          <w:b/>
-          <w:bCs/>
-          <w:sz w:val="36"/>
-          <w:szCs w:val="36"/>
-          <w:lang w:eastAsia="es-VE"/>
-        </w:rPr>
-        <w:t>Lanes</w:t>
-      </w:r>
-      <w:proofErr w:type="spellEnd"/>
-      <w:r>
-        <w:rPr>
-          <w:rFonts w:ascii="Times New Roman" w:eastAsia="Times New Roman" w:hAnsi="Times New Roman" w:cs="Times New Roman"/>
-          <w:b/>
-          <w:bCs/>
-          <w:sz w:val="36"/>
-          <w:szCs w:val="36"/>
-          <w:lang w:eastAsia="es-VE"/>
-        </w:rPr>
-        <w:t>)</w:t>
+        <w:t>2. Actores Involucrados (Lanes)</w:t>
       </w:r>
     </w:p>
     <w:p>
@@ -4069,55 +3805,7 @@
           <w:szCs w:val="24"/>
           <w:lang w:eastAsia="es-VE"/>
         </w:rPr>
-        <w:t xml:space="preserve">Sistema BPMS / </w:t>
-      </w:r>
-      <w:proofErr w:type="spellStart"/>
-      <w:r>
-        <w:rPr>
-          <w:rFonts w:ascii="Times New Roman" w:eastAsia="Times New Roman" w:hAnsi="Times New Roman" w:cs="Times New Roman"/>
-          <w:b/>
-          <w:bCs/>
-          <w:sz w:val="24"/>
-          <w:szCs w:val="24"/>
-          <w:lang w:eastAsia="es-VE"/>
-        </w:rPr>
-        <w:t>vTiger</w:t>
-      </w:r>
-      <w:proofErr w:type="spellEnd"/>
-      <w:r>
-        <w:rPr>
-          <w:rFonts w:ascii="Times New Roman" w:eastAsia="Times New Roman" w:hAnsi="Times New Roman" w:cs="Times New Roman"/>
-          <w:b/>
-          <w:bCs/>
-          <w:sz w:val="24"/>
-          <w:szCs w:val="24"/>
-          <w:lang w:eastAsia="es-VE"/>
-        </w:rPr>
-        <w:t xml:space="preserve"> (</w:t>
-      </w:r>
-      <w:proofErr w:type="spellStart"/>
-      <w:r>
-        <w:rPr>
-          <w:rFonts w:ascii="Times New Roman" w:eastAsia="Times New Roman" w:hAnsi="Times New Roman" w:cs="Times New Roman"/>
-          <w:b/>
-          <w:bCs/>
-          <w:sz w:val="24"/>
-          <w:szCs w:val="24"/>
-          <w:lang w:eastAsia="es-VE"/>
-        </w:rPr>
-        <w:t>Automatizador</w:t>
-      </w:r>
-      <w:proofErr w:type="spellEnd"/>
-      <w:r>
-        <w:rPr>
-          <w:rFonts w:ascii="Times New Roman" w:eastAsia="Times New Roman" w:hAnsi="Times New Roman" w:cs="Times New Roman"/>
-          <w:b/>
-          <w:bCs/>
-          <w:sz w:val="24"/>
-          <w:szCs w:val="24"/>
-          <w:lang w:eastAsia="es-VE"/>
-        </w:rPr>
-        <w:t>):</w:t>
+        <w:t>Sistema BPMS / vTiger (Automatizador):</w:t>
       </w:r>
       <w:r>
         <w:rPr>
@@ -4230,7 +3918,6 @@
         </w:rPr>
         <w:t>Se diferencia entre tareas de usuario (</w:t>
       </w:r>
-      <w:proofErr w:type="spellStart"/>
       <w:r>
         <w:rPr>
           <w:rFonts w:ascii="Times New Roman" w:eastAsia="Times New Roman" w:hAnsi="Times New Roman" w:cs="Times New Roman"/>
@@ -4240,9 +3927,17 @@
           <w:szCs w:val="24"/>
           <w:lang w:eastAsia="es-VE"/>
         </w:rPr>
-        <w:t>User</w:t>
-      </w:r>
-      <w:proofErr w:type="spellEnd"/>
+        <w:t>User Task</w:t>
+      </w:r>
+      <w:r>
+        <w:rPr>
+          <w:rFonts w:ascii="Times New Roman" w:eastAsia="Times New Roman" w:hAnsi="Times New Roman" w:cs="Times New Roman"/>
+          <w:sz w:val="24"/>
+          <w:szCs w:val="24"/>
+          <w:lang w:eastAsia="es-VE"/>
+        </w:rPr>
+        <w:t>) y tareas automáticas del sistema (</w:t>
+      </w:r>
       <w:r>
         <w:rPr>
           <w:rFonts w:ascii="Times New Roman" w:eastAsia="Times New Roman" w:hAnsi="Times New Roman" w:cs="Times New Roman"/>
@@ -4252,67 +3947,8 @@
           <w:szCs w:val="24"/>
           <w:lang w:eastAsia="es-VE"/>
         </w:rPr>
-        <w:t xml:space="preserve"> </w:t>
-      </w:r>
-      <w:proofErr w:type="spellStart"/>
-      <w:r>
-        <w:rPr>
-          <w:rFonts w:ascii="Times New Roman" w:eastAsia="Times New Roman" w:hAnsi="Times New Roman" w:cs="Times New Roman"/>
-          <w:b/>
-          <w:bCs/>
-          <w:sz w:val="24"/>
-          <w:szCs w:val="24"/>
-          <w:lang w:eastAsia="es-VE"/>
-        </w:rPr>
-        <w:t>Task</w:t>
-      </w:r>
-      <w:proofErr w:type="spellEnd"/>
-      <w:r>
-        <w:rPr>
-          <w:rFonts w:ascii="Times New Roman" w:eastAsia="Times New Roman" w:hAnsi="Times New Roman" w:cs="Times New Roman"/>
-          <w:sz w:val="24"/>
-          <w:szCs w:val="24"/>
-          <w:lang w:eastAsia="es-VE"/>
-        </w:rPr>
-        <w:t>) y tareas automáticas del sistema (</w:t>
-      </w:r>
-      <w:proofErr w:type="spellStart"/>
-      <w:r>
-        <w:rPr>
-          <w:rFonts w:ascii="Times New Roman" w:eastAsia="Times New Roman" w:hAnsi="Times New Roman" w:cs="Times New Roman"/>
-          <w:b/>
-          <w:bCs/>
-          <w:sz w:val="24"/>
-          <w:szCs w:val="24"/>
-          <w:lang w:eastAsia="es-VE"/>
-        </w:rPr>
-        <w:t>Service</w:t>
-      </w:r>
-      <w:proofErr w:type="spellEnd"/>
-      <w:r>
-        <w:rPr>
-          <w:rFonts w:ascii="Times New Roman" w:eastAsia="Times New Roman" w:hAnsi="Times New Roman" w:cs="Times New Roman"/>
-          <w:b/>
-          <w:bCs/>
-          <w:sz w:val="24"/>
-          <w:szCs w:val="24"/>
-          <w:lang w:eastAsia="es-VE"/>
-        </w:rPr>
-        <w:t xml:space="preserve"> </w:t>
-      </w:r>
-      <w:proofErr w:type="spellStart"/>
-      <w:r>
-        <w:rPr>
-          <w:rFonts w:ascii="Times New Roman" w:eastAsia="Times New Roman" w:hAnsi="Times New Roman" w:cs="Times New Roman"/>
-          <w:b/>
-          <w:bCs/>
-          <w:sz w:val="24"/>
-          <w:szCs w:val="24"/>
-          <w:lang w:eastAsia="es-VE"/>
-        </w:rPr>
-        <w:t>Task</w:t>
-      </w:r>
-      <w:proofErr w:type="spellEnd"/>
+        <w:t>Service Task</w:t>
+      </w:r>
       <w:r>
         <w:rPr>
           <w:rFonts w:ascii="Times New Roman" w:eastAsia="Times New Roman" w:hAnsi="Times New Roman" w:cs="Times New Roman"/>
@@ -4546,7 +4182,6 @@
                 <w:lang w:eastAsia="es-VE"/>
               </w:rPr>
             </w:pPr>
-            <w:proofErr w:type="spellStart"/>
             <w:r>
               <w:rPr>
                 <w:rFonts w:ascii="Times New Roman" w:eastAsia="Times New Roman" w:hAnsi="Times New Roman" w:cs="Times New Roman"/>
@@ -4556,19 +4191,7 @@
                 <w:szCs w:val="24"/>
                 <w:lang w:eastAsia="es-VE"/>
               </w:rPr>
-              <w:t>vTiger</w:t>
-            </w:r>
-            <w:proofErr w:type="spellEnd"/>
-            <w:r>
-              <w:rPr>
-                <w:rFonts w:ascii="Times New Roman" w:eastAsia="Times New Roman" w:hAnsi="Times New Roman" w:cs="Times New Roman"/>
-                <w:b/>
-                <w:bCs/>
-                <w:sz w:val="24"/>
-                <w:szCs w:val="24"/>
-                <w:lang w:eastAsia="es-VE"/>
-              </w:rPr>
-              <w:t xml:space="preserve"> CRM</w:t>
+              <w:t>vTiger CRM</w:t>
             </w:r>
           </w:p>
         </w:tc>
@@ -4627,45 +4250,14 @@
                 <w:lang w:eastAsia="es-VE"/>
               </w:rPr>
             </w:pPr>
-            <w:proofErr w:type="spellStart"/>
-            <w:r>
-              <w:rPr>
-                <w:rFonts w:ascii="Times New Roman" w:eastAsia="Times New Roman" w:hAnsi="Times New Roman" w:cs="Times New Roman"/>
-                <w:sz w:val="24"/>
-                <w:szCs w:val="24"/>
-                <w:lang w:eastAsia="es-VE"/>
-              </w:rPr>
-              <w:t>Service</w:t>
-            </w:r>
-            <w:proofErr w:type="spellEnd"/>
-            <w:r>
-              <w:rPr>
-                <w:rFonts w:ascii="Times New Roman" w:eastAsia="Times New Roman" w:hAnsi="Times New Roman" w:cs="Times New Roman"/>
-                <w:sz w:val="24"/>
-                <w:szCs w:val="24"/>
-                <w:lang w:eastAsia="es-VE"/>
-              </w:rPr>
-              <w:t xml:space="preserve"> </w:t>
-            </w:r>
-            <w:proofErr w:type="spellStart"/>
-            <w:r>
-              <w:rPr>
-                <w:rFonts w:ascii="Times New Roman" w:eastAsia="Times New Roman" w:hAnsi="Times New Roman" w:cs="Times New Roman"/>
-                <w:sz w:val="24"/>
-                <w:szCs w:val="24"/>
-                <w:lang w:eastAsia="es-VE"/>
-              </w:rPr>
-              <w:t>Task</w:t>
-            </w:r>
-            <w:proofErr w:type="spellEnd"/>
-            <w:r>
-              <w:rPr>
-                <w:rFonts w:ascii="Times New Roman" w:eastAsia="Times New Roman" w:hAnsi="Times New Roman" w:cs="Times New Roman"/>
-                <w:sz w:val="24"/>
-                <w:szCs w:val="24"/>
-                <w:lang w:eastAsia="es-VE"/>
-              </w:rPr>
-              <w:t xml:space="preserve"> </w:t>
+            <w:r>
+              <w:rPr>
+                <w:rFonts w:ascii="Times New Roman" w:eastAsia="Times New Roman" w:hAnsi="Times New Roman" w:cs="Times New Roman"/>
+                <w:sz w:val="24"/>
+                <w:szCs w:val="24"/>
+                <w:lang w:eastAsia="es-VE"/>
+              </w:rPr>
+              <w:t xml:space="preserve">Service Task </w:t>
             </w:r>
           </w:p>
         </w:tc>
@@ -4729,7 +4321,6 @@
                 <w:lang w:eastAsia="es-VE"/>
               </w:rPr>
             </w:pPr>
-            <w:proofErr w:type="spellStart"/>
             <w:r>
               <w:rPr>
                 <w:rFonts w:ascii="Times New Roman" w:eastAsia="Times New Roman" w:hAnsi="Times New Roman" w:cs="Times New Roman"/>
@@ -4739,19 +4330,7 @@
                 <w:szCs w:val="24"/>
                 <w:lang w:eastAsia="es-VE"/>
               </w:rPr>
-              <w:t>vTiger</w:t>
-            </w:r>
-            <w:proofErr w:type="spellEnd"/>
-            <w:r>
-              <w:rPr>
-                <w:rFonts w:ascii="Times New Roman" w:eastAsia="Times New Roman" w:hAnsi="Times New Roman" w:cs="Times New Roman"/>
-                <w:b/>
-                <w:bCs/>
-                <w:sz w:val="24"/>
-                <w:szCs w:val="24"/>
-                <w:lang w:eastAsia="es-VE"/>
-              </w:rPr>
-              <w:t xml:space="preserve"> CRM</w:t>
+              <w:t>vTiger CRM</w:t>
             </w:r>
           </w:p>
         </w:tc>
@@ -4810,45 +4389,14 @@
                 <w:lang w:eastAsia="es-VE"/>
               </w:rPr>
             </w:pPr>
-            <w:proofErr w:type="spellStart"/>
-            <w:r>
-              <w:rPr>
-                <w:rFonts w:ascii="Times New Roman" w:eastAsia="Times New Roman" w:hAnsi="Times New Roman" w:cs="Times New Roman"/>
-                <w:sz w:val="24"/>
-                <w:szCs w:val="24"/>
-                <w:lang w:eastAsia="es-VE"/>
-              </w:rPr>
-              <w:t>Service</w:t>
-            </w:r>
-            <w:proofErr w:type="spellEnd"/>
-            <w:r>
-              <w:rPr>
-                <w:rFonts w:ascii="Times New Roman" w:eastAsia="Times New Roman" w:hAnsi="Times New Roman" w:cs="Times New Roman"/>
-                <w:sz w:val="24"/>
-                <w:szCs w:val="24"/>
-                <w:lang w:eastAsia="es-VE"/>
-              </w:rPr>
-              <w:t xml:space="preserve"> </w:t>
-            </w:r>
-            <w:proofErr w:type="spellStart"/>
-            <w:r>
-              <w:rPr>
-                <w:rFonts w:ascii="Times New Roman" w:eastAsia="Times New Roman" w:hAnsi="Times New Roman" w:cs="Times New Roman"/>
-                <w:sz w:val="24"/>
-                <w:szCs w:val="24"/>
-                <w:lang w:eastAsia="es-VE"/>
-              </w:rPr>
-              <w:t>Task</w:t>
-            </w:r>
-            <w:proofErr w:type="spellEnd"/>
-            <w:r>
-              <w:rPr>
-                <w:rFonts w:ascii="Times New Roman" w:eastAsia="Times New Roman" w:hAnsi="Times New Roman" w:cs="Times New Roman"/>
-                <w:sz w:val="24"/>
-                <w:szCs w:val="24"/>
-                <w:lang w:eastAsia="es-VE"/>
-              </w:rPr>
-              <w:t xml:space="preserve"> </w:t>
+            <w:r>
+              <w:rPr>
+                <w:rFonts w:ascii="Times New Roman" w:eastAsia="Times New Roman" w:hAnsi="Times New Roman" w:cs="Times New Roman"/>
+                <w:sz w:val="24"/>
+                <w:szCs w:val="24"/>
+                <w:lang w:eastAsia="es-VE"/>
+              </w:rPr>
+              <w:t xml:space="preserve">Service Task </w:t>
             </w:r>
           </w:p>
         </w:tc>
@@ -4980,45 +4528,14 @@
                 <w:lang w:eastAsia="es-VE"/>
               </w:rPr>
             </w:pPr>
-            <w:proofErr w:type="spellStart"/>
-            <w:r>
-              <w:rPr>
-                <w:rFonts w:ascii="Times New Roman" w:eastAsia="Times New Roman" w:hAnsi="Times New Roman" w:cs="Times New Roman"/>
-                <w:sz w:val="24"/>
-                <w:szCs w:val="24"/>
-                <w:lang w:eastAsia="es-VE"/>
-              </w:rPr>
-              <w:t>User</w:t>
-            </w:r>
-            <w:proofErr w:type="spellEnd"/>
-            <w:r>
-              <w:rPr>
-                <w:rFonts w:ascii="Times New Roman" w:eastAsia="Times New Roman" w:hAnsi="Times New Roman" w:cs="Times New Roman"/>
-                <w:sz w:val="24"/>
-                <w:szCs w:val="24"/>
-                <w:lang w:eastAsia="es-VE"/>
-              </w:rPr>
-              <w:t xml:space="preserve"> </w:t>
-            </w:r>
-            <w:proofErr w:type="spellStart"/>
-            <w:r>
-              <w:rPr>
-                <w:rFonts w:ascii="Times New Roman" w:eastAsia="Times New Roman" w:hAnsi="Times New Roman" w:cs="Times New Roman"/>
-                <w:sz w:val="24"/>
-                <w:szCs w:val="24"/>
-                <w:lang w:eastAsia="es-VE"/>
-              </w:rPr>
-              <w:t>Task</w:t>
-            </w:r>
-            <w:proofErr w:type="spellEnd"/>
-            <w:r>
-              <w:rPr>
-                <w:rFonts w:ascii="Times New Roman" w:eastAsia="Times New Roman" w:hAnsi="Times New Roman" w:cs="Times New Roman"/>
-                <w:sz w:val="24"/>
-                <w:szCs w:val="24"/>
-                <w:lang w:eastAsia="es-VE"/>
-              </w:rPr>
-              <w:t xml:space="preserve"> </w:t>
+            <w:r>
+              <w:rPr>
+                <w:rFonts w:ascii="Times New Roman" w:eastAsia="Times New Roman" w:hAnsi="Times New Roman" w:cs="Times New Roman"/>
+                <w:sz w:val="24"/>
+                <w:szCs w:val="24"/>
+                <w:lang w:eastAsia="es-VE"/>
+              </w:rPr>
+              <w:t xml:space="preserve">User Task </w:t>
             </w:r>
           </w:p>
         </w:tc>
@@ -5082,7 +4599,6 @@
                 <w:lang w:eastAsia="es-VE"/>
               </w:rPr>
             </w:pPr>
-            <w:proofErr w:type="spellStart"/>
             <w:r>
               <w:rPr>
                 <w:rFonts w:ascii="Times New Roman" w:eastAsia="Times New Roman" w:hAnsi="Times New Roman" w:cs="Times New Roman"/>
@@ -5092,19 +4608,7 @@
                 <w:szCs w:val="24"/>
                 <w:lang w:eastAsia="es-VE"/>
               </w:rPr>
-              <w:t>vTiger</w:t>
-            </w:r>
-            <w:proofErr w:type="spellEnd"/>
-            <w:r>
-              <w:rPr>
-                <w:rFonts w:ascii="Times New Roman" w:eastAsia="Times New Roman" w:hAnsi="Times New Roman" w:cs="Times New Roman"/>
-                <w:b/>
-                <w:bCs/>
-                <w:sz w:val="24"/>
-                <w:szCs w:val="24"/>
-                <w:lang w:eastAsia="es-VE"/>
-              </w:rPr>
-              <w:t xml:space="preserve"> CRM</w:t>
+              <w:t>vTiger CRM</w:t>
             </w:r>
           </w:p>
         </w:tc>
@@ -5163,45 +4667,14 @@
                 <w:lang w:eastAsia="es-VE"/>
               </w:rPr>
             </w:pPr>
-            <w:proofErr w:type="spellStart"/>
-            <w:r>
-              <w:rPr>
-                <w:rFonts w:ascii="Times New Roman" w:eastAsia="Times New Roman" w:hAnsi="Times New Roman" w:cs="Times New Roman"/>
-                <w:sz w:val="24"/>
-                <w:szCs w:val="24"/>
-                <w:lang w:eastAsia="es-VE"/>
-              </w:rPr>
-              <w:t>Service</w:t>
-            </w:r>
-            <w:proofErr w:type="spellEnd"/>
-            <w:r>
-              <w:rPr>
-                <w:rFonts w:ascii="Times New Roman" w:eastAsia="Times New Roman" w:hAnsi="Times New Roman" w:cs="Times New Roman"/>
-                <w:sz w:val="24"/>
-                <w:szCs w:val="24"/>
-                <w:lang w:eastAsia="es-VE"/>
-              </w:rPr>
-              <w:t xml:space="preserve"> </w:t>
-            </w:r>
-            <w:proofErr w:type="spellStart"/>
-            <w:r>
-              <w:rPr>
-                <w:rFonts w:ascii="Times New Roman" w:eastAsia="Times New Roman" w:hAnsi="Times New Roman" w:cs="Times New Roman"/>
-                <w:sz w:val="24"/>
-                <w:szCs w:val="24"/>
-                <w:lang w:eastAsia="es-VE"/>
-              </w:rPr>
-              <w:t>Task</w:t>
-            </w:r>
-            <w:proofErr w:type="spellEnd"/>
-            <w:r>
-              <w:rPr>
-                <w:rFonts w:ascii="Times New Roman" w:eastAsia="Times New Roman" w:hAnsi="Times New Roman" w:cs="Times New Roman"/>
-                <w:sz w:val="24"/>
-                <w:szCs w:val="24"/>
-                <w:lang w:eastAsia="es-VE"/>
-              </w:rPr>
-              <w:t xml:space="preserve"> </w:t>
+            <w:r>
+              <w:rPr>
+                <w:rFonts w:ascii="Times New Roman" w:eastAsia="Times New Roman" w:hAnsi="Times New Roman" w:cs="Times New Roman"/>
+                <w:sz w:val="24"/>
+                <w:szCs w:val="24"/>
+                <w:lang w:eastAsia="es-VE"/>
+              </w:rPr>
+              <w:t xml:space="preserve">Service Task </w:t>
             </w:r>
           </w:p>
         </w:tc>
@@ -5265,7 +4738,6 @@
                 <w:lang w:eastAsia="es-VE"/>
               </w:rPr>
             </w:pPr>
-            <w:proofErr w:type="spellStart"/>
             <w:r>
               <w:rPr>
                 <w:rFonts w:ascii="Times New Roman" w:eastAsia="Times New Roman" w:hAnsi="Times New Roman" w:cs="Times New Roman"/>
@@ -5275,19 +4747,7 @@
                 <w:szCs w:val="24"/>
                 <w:lang w:eastAsia="es-VE"/>
               </w:rPr>
-              <w:t>vTiger</w:t>
-            </w:r>
-            <w:proofErr w:type="spellEnd"/>
-            <w:r>
-              <w:rPr>
-                <w:rFonts w:ascii="Times New Roman" w:eastAsia="Times New Roman" w:hAnsi="Times New Roman" w:cs="Times New Roman"/>
-                <w:b/>
-                <w:bCs/>
-                <w:sz w:val="24"/>
-                <w:szCs w:val="24"/>
-                <w:lang w:eastAsia="es-VE"/>
-              </w:rPr>
-              <w:t xml:space="preserve"> CRM</w:t>
+              <w:t>vTiger CRM</w:t>
             </w:r>
           </w:p>
         </w:tc>
@@ -5346,45 +4806,14 @@
                 <w:lang w:eastAsia="es-VE"/>
               </w:rPr>
             </w:pPr>
-            <w:proofErr w:type="spellStart"/>
-            <w:r>
-              <w:rPr>
-                <w:rFonts w:ascii="Times New Roman" w:eastAsia="Times New Roman" w:hAnsi="Times New Roman" w:cs="Times New Roman"/>
-                <w:sz w:val="24"/>
-                <w:szCs w:val="24"/>
-                <w:lang w:eastAsia="es-VE"/>
-              </w:rPr>
-              <w:t>Service</w:t>
-            </w:r>
-            <w:proofErr w:type="spellEnd"/>
-            <w:r>
-              <w:rPr>
-                <w:rFonts w:ascii="Times New Roman" w:eastAsia="Times New Roman" w:hAnsi="Times New Roman" w:cs="Times New Roman"/>
-                <w:sz w:val="24"/>
-                <w:szCs w:val="24"/>
-                <w:lang w:eastAsia="es-VE"/>
-              </w:rPr>
-              <w:t xml:space="preserve"> </w:t>
-            </w:r>
-            <w:proofErr w:type="spellStart"/>
-            <w:r>
-              <w:rPr>
-                <w:rFonts w:ascii="Times New Roman" w:eastAsia="Times New Roman" w:hAnsi="Times New Roman" w:cs="Times New Roman"/>
-                <w:sz w:val="24"/>
-                <w:szCs w:val="24"/>
-                <w:lang w:eastAsia="es-VE"/>
-              </w:rPr>
-              <w:t>Task</w:t>
-            </w:r>
-            <w:proofErr w:type="spellEnd"/>
-            <w:r>
-              <w:rPr>
-                <w:rFonts w:ascii="Times New Roman" w:eastAsia="Times New Roman" w:hAnsi="Times New Roman" w:cs="Times New Roman"/>
-                <w:sz w:val="24"/>
-                <w:szCs w:val="24"/>
-                <w:lang w:eastAsia="es-VE"/>
-              </w:rPr>
-              <w:t xml:space="preserve"> </w:t>
+            <w:r>
+              <w:rPr>
+                <w:rFonts w:ascii="Times New Roman" w:eastAsia="Times New Roman" w:hAnsi="Times New Roman" w:cs="Times New Roman"/>
+                <w:sz w:val="24"/>
+                <w:szCs w:val="24"/>
+                <w:lang w:eastAsia="es-VE"/>
+              </w:rPr>
+              <w:t xml:space="preserve">Service Task </w:t>
             </w:r>
           </w:p>
         </w:tc>
@@ -5655,45 +5084,14 @@
                 <w:lang w:eastAsia="es-VE"/>
               </w:rPr>
             </w:pPr>
-            <w:proofErr w:type="spellStart"/>
-            <w:r>
-              <w:rPr>
-                <w:rFonts w:ascii="Times New Roman" w:eastAsia="Times New Roman" w:hAnsi="Times New Roman" w:cs="Times New Roman"/>
-                <w:sz w:val="24"/>
-                <w:szCs w:val="24"/>
-                <w:lang w:eastAsia="es-VE"/>
-              </w:rPr>
-              <w:t>Service</w:t>
-            </w:r>
-            <w:proofErr w:type="spellEnd"/>
-            <w:r>
-              <w:rPr>
-                <w:rFonts w:ascii="Times New Roman" w:eastAsia="Times New Roman" w:hAnsi="Times New Roman" w:cs="Times New Roman"/>
-                <w:sz w:val="24"/>
-                <w:szCs w:val="24"/>
-                <w:lang w:eastAsia="es-VE"/>
-              </w:rPr>
-              <w:t xml:space="preserve"> </w:t>
-            </w:r>
-            <w:proofErr w:type="spellStart"/>
-            <w:r>
-              <w:rPr>
-                <w:rFonts w:ascii="Times New Roman" w:eastAsia="Times New Roman" w:hAnsi="Times New Roman" w:cs="Times New Roman"/>
-                <w:sz w:val="24"/>
-                <w:szCs w:val="24"/>
-                <w:lang w:eastAsia="es-VE"/>
-              </w:rPr>
-              <w:t>Task</w:t>
-            </w:r>
-            <w:proofErr w:type="spellEnd"/>
-            <w:r>
-              <w:rPr>
-                <w:rFonts w:ascii="Times New Roman" w:eastAsia="Times New Roman" w:hAnsi="Times New Roman" w:cs="Times New Roman"/>
-                <w:sz w:val="24"/>
-                <w:szCs w:val="24"/>
-                <w:lang w:eastAsia="es-VE"/>
-              </w:rPr>
-              <w:t xml:space="preserve"> </w:t>
+            <w:r>
+              <w:rPr>
+                <w:rFonts w:ascii="Times New Roman" w:eastAsia="Times New Roman" w:hAnsi="Times New Roman" w:cs="Times New Roman"/>
+                <w:sz w:val="24"/>
+                <w:szCs w:val="24"/>
+                <w:lang w:eastAsia="es-VE"/>
+              </w:rPr>
+              <w:t xml:space="preserve">Service Task </w:t>
             </w:r>
           </w:p>
         </w:tc>
@@ -5743,31 +5141,7 @@
           <w:szCs w:val="36"/>
           <w:lang w:eastAsia="es-VE"/>
         </w:rPr>
-        <w:t>4. Reglas de Negocio y Puertas de Enlace (</w:t>
-      </w:r>
-      <w:proofErr w:type="spellStart"/>
-      <w:r>
-        <w:rPr>
-          <w:rFonts w:ascii="Times New Roman" w:eastAsia="Times New Roman" w:hAnsi="Times New Roman" w:cs="Times New Roman"/>
-          <w:b/>
-          <w:bCs/>
-          <w:sz w:val="36"/>
-          <w:szCs w:val="36"/>
-          <w:lang w:eastAsia="es-VE"/>
-        </w:rPr>
-        <w:t>Gateways</w:t>
-      </w:r>
-      <w:proofErr w:type="spellEnd"/>
-      <w:r>
-        <w:rPr>
-          <w:rFonts w:ascii="Times New Roman" w:eastAsia="Times New Roman" w:hAnsi="Times New Roman" w:cs="Times New Roman"/>
-          <w:b/>
-          <w:bCs/>
-          <w:sz w:val="36"/>
-          <w:szCs w:val="36"/>
-          <w:lang w:eastAsia="es-VE"/>
-        </w:rPr>
-        <w:t>)</w:t>
+        <w:t>4. Reglas de Negocio y Puertas de Enlace (Gateways)</w:t>
       </w:r>
     </w:p>
     <w:p>
@@ -5868,27 +5242,7 @@
           <w:szCs w:val="24"/>
           <w:lang w:eastAsia="es-VE"/>
         </w:rPr>
-        <w:t xml:space="preserve"> El monto del </w:t>
-      </w:r>
-      <w:proofErr w:type="spellStart"/>
-      <w:r>
-        <w:rPr>
-          <w:rFonts w:ascii="Times New Roman" w:eastAsia="Times New Roman" w:hAnsi="Times New Roman" w:cs="Times New Roman"/>
-          <w:sz w:val="24"/>
-          <w:szCs w:val="24"/>
-          <w:lang w:eastAsia="es-VE"/>
-        </w:rPr>
-        <w:t>voucher</w:t>
-      </w:r>
-      <w:proofErr w:type="spellEnd"/>
-      <w:r>
-        <w:rPr>
-          <w:rFonts w:ascii="Times New Roman" w:eastAsia="Times New Roman" w:hAnsi="Times New Roman" w:cs="Times New Roman"/>
-          <w:sz w:val="24"/>
-          <w:szCs w:val="24"/>
-          <w:lang w:eastAsia="es-VE"/>
-        </w:rPr>
-        <w:t xml:space="preserve"> cargado coincide con el valor del ítem seleccionado. </w:t>
+        <w:t xml:space="preserve"> El monto del voucher cargado coincide con el valor del ítem seleccionado. </w:t>
       </w:r>
     </w:p>
     <w:p>
@@ -6196,6 +5550,59 @@
     <w:p>
       <w:r>
         <w:br w:type="page"/>
+      </w:r>
+      <w:r>
+        <w:rPr>
+          <w:noProof/>
+        </w:rPr>
+        <w:drawing>
+          <wp:inline distT="0" distB="0" distL="0" distR="0" wp14:anchorId="75E3D895" wp14:editId="7B1878DD">
+            <wp:extent cx="15615920" cy="4631690"/>
+            <wp:effectExtent l="0" t="0" r="5080" b="0"/>
+            <wp:docPr id="3" name="Imagen 3"/>
+            <wp:cNvGraphicFramePr>
+              <a:graphicFrameLocks xmlns:a="http://schemas.openxmlformats.org/drawingml/2006/main" noChangeAspect="1"/>
+            </wp:cNvGraphicFramePr>
+            <a:graphic xmlns:a="http://schemas.openxmlformats.org/drawingml/2006/main">
+              <a:graphicData uri="http://schemas.openxmlformats.org/drawingml/2006/picture">
+                <pic:pic xmlns:pic="http://schemas.openxmlformats.org/drawingml/2006/picture">
+                  <pic:nvPicPr>
+                    <pic:cNvPr id="0" name="Picture 7"/>
+                    <pic:cNvPicPr>
+                      <a:picLocks noChangeAspect="1" noChangeArrowheads="1"/>
+                    </pic:cNvPicPr>
+                  </pic:nvPicPr>
+                  <pic:blipFill>
+                    <a:blip r:embed="rId6">
+                      <a:extLst>
+                        <a:ext uri="{28A0092B-C50C-407E-A947-70E740481C1C}">
+                          <a14:useLocalDpi xmlns:a14="http://schemas.microsoft.com/office/drawing/2010/main" val="0"/>
+                        </a:ext>
+                      </a:extLst>
+                    </a:blip>
+                    <a:srcRect/>
+                    <a:stretch>
+                      <a:fillRect/>
+                    </a:stretch>
+                  </pic:blipFill>
+                  <pic:spPr bwMode="auto">
+                    <a:xfrm>
+                      <a:off x="0" y="0"/>
+                      <a:ext cx="15615920" cy="4631690"/>
+                    </a:xfrm>
+                    <a:prstGeom prst="rect">
+                      <a:avLst/>
+                    </a:prstGeom>
+                    <a:noFill/>
+                    <a:ln>
+                      <a:noFill/>
+                    </a:ln>
+                  </pic:spPr>
+                </pic:pic>
+              </a:graphicData>
+            </a:graphic>
+          </wp:inline>
+        </w:drawing>
       </w:r>
     </w:p>
     <w:p/>

</xml_diff>